<commit_message>
Update funding brief for the Azure OpenAI / GPT switch
MaceStyle's live pilot now runs on GPT-5 via Azure OpenAI (Microsoft-native),
so the brief for Tobias is reframed accordingly:
- present-tense "already switched & proven", not "proposed"
- lead with Azure OpenAI as the Microsoft-native, no-marketplace-step path;
  Claude via Foundry kept as a one-setting alternative
- measured per-document cost table (GPT ~35-50% cheaper; both a few £/mo)
- diagram redrawn Mace Azure -> MaceStyle -> Azure OpenAI -> GPT-5

Regenerated all four formats (.md/.docx/.html/.pdf) + generate_brief_docx.py.

Co-Authored-By: Claude Opus 4.8 <noreply@anthropic.com>
</commit_message>
<xml_diff>
--- a/docs/mace-funding-brief.docx
+++ b/docs/mace-funding-brief.docx
@@ -79,7 +79,7 @@
           <w:color w:val="5B5850"/>
           <w:sz w:val="17"/>
         </w:rPr>
-        <w:t xml:space="preserve"> by Stephen Cummins · AI Service Lead, Mace Digital · 2 July 2026</w:t>
+        <w:t xml:space="preserve"> by Stephen Cummins · AI Service Lead, Mace Digital · 2 July 2026 (updated 5 July 2026)</w:t>
       </w:r>
     </w:p>
     <w:tbl>
@@ -108,7 +108,7 @@
                 <w:color w:val="130B01"/>
                 <w:sz w:val="22"/>
               </w:rPr>
-              <w:t xml:space="preserve">MaceStyle can run entirely on </w:t>
+              <w:t xml:space="preserve">MaceStyle now runs its AI on </w:t>
             </w:r>
             <w:r>
               <w:rPr>
@@ -117,7 +117,7 @@
                 <w:color w:val="892B90"/>
                 <w:sz w:val="22"/>
               </w:rPr>
-              <w:t>Mace's own Azure billing and governance</w:t>
+              <w:t>GPT via Azure OpenAI</w:t>
             </w:r>
             <w:r>
               <w:rPr>
@@ -126,7 +126,25 @@
                 <w:color w:val="130B01"/>
                 <w:sz w:val="22"/>
               </w:rPr>
-              <w:t xml:space="preserve">, at </w:t>
+              <w:t xml:space="preserve"> — </w:t>
+            </w:r>
+            <w:r>
+              <w:rPr>
+                <w:rFonts w:ascii="Arial" w:hAnsi="Arial"/>
+                <w:b/>
+                <w:color w:val="892B90"/>
+                <w:sz w:val="22"/>
+              </w:rPr>
+              <w:t>Microsoft-native</w:t>
+            </w:r>
+            <w:r>
+              <w:rPr>
+                <w:rFonts w:ascii="Arial" w:hAnsi="Arial"/>
+                <w:b w:val="0"/>
+                <w:color w:val="130B01"/>
+                <w:sz w:val="22"/>
+              </w:rPr>
+              <w:t xml:space="preserve">, on Azure billing and governance, at </w:t>
             </w:r>
             <w:r>
               <w:rPr>
@@ -144,25 +162,7 @@
                 <w:color w:val="130B01"/>
                 <w:sz w:val="22"/>
               </w:rPr>
-              <w:t xml:space="preserve">, with </w:t>
-            </w:r>
-            <w:r>
-              <w:rPr>
-                <w:rFonts w:ascii="Arial" w:hAnsi="Arial"/>
-                <w:b/>
-                <w:color w:val="892B90"/>
-                <w:sz w:val="22"/>
-              </w:rPr>
-              <w:t>zero code changes</w:t>
-            </w:r>
-            <w:r>
-              <w:rPr>
-                <w:rFonts w:ascii="Arial" w:hAnsi="Arial"/>
-                <w:b w:val="0"/>
-                <w:color w:val="130B01"/>
-                <w:sz w:val="22"/>
-              </w:rPr>
-              <w:t>. I've already proven the switch end-to-end. It needs a Mace Azure subscription to own it and a data-governance nod. Then it's roughly half a day to cut over.</w:t>
+              <w:t>. I've already made the switch and proven it end-to-end on the live pilot. To make it a Mace service it needs a Mace Azure subscription to own it and a data-governance nod. Then it's roughly half a day to cut over.</w:t>
             </w:r>
           </w:p>
         </w:tc>
@@ -215,7 +215,72 @@
           <w:color w:val="130B01"/>
           <w:sz w:val="21"/>
         </w:rPr>
-        <w:t>MaceStyle reads documents in the Mace Way Control Centre and checks them against the Writing Style Guide — British spelling, contractions, symbols, number and font standards — flagging issues and proposing corrections. It is live in pilot, validated by testers (Natasha, Jade) in June. The intelligent rules are powered by Claude, which handles the judgement calls a simple find-and-replace can't.</w:t>
+        <w:t>MaceStyle reads documents in the Mace Way Control Centre and checks them against the Writing Style Guide — British spelling, contractions, symbols, number and font standards — flagging issues and proposing corrections. It is live in pilot, validated by testers (Natasha, Jade) in June. The intelligent rules — the judgement calls a simple find-and-replace can't make — are powered by AI.</w:t>
+      </w:r>
+    </w:p>
+    <w:p>
+      <w:pPr>
+        <w:spacing w:after="120" w:before="0"/>
+      </w:pPr>
+      <w:r>
+        <w:rPr>
+          <w:rFonts w:ascii="Arial" w:hAnsi="Arial"/>
+          <w:b/>
+          <w:i w:val="0"/>
+          <w:color w:val="130B01"/>
+          <w:sz w:val="21"/>
+        </w:rPr>
+        <w:t xml:space="preserve">What changed this month: </w:t>
+      </w:r>
+      <w:r>
+        <w:rPr>
+          <w:rFonts w:ascii="Arial" w:hAnsi="Arial"/>
+          <w:b w:val="0"/>
+          <w:i w:val="0"/>
+          <w:color w:val="130B01"/>
+          <w:sz w:val="21"/>
+        </w:rPr>
+        <w:t xml:space="preserve">I re-architected MaceStyle so the AI backend is </w:t>
+      </w:r>
+      <w:r>
+        <w:rPr>
+          <w:rFonts w:ascii="Arial" w:hAnsi="Arial"/>
+          <w:b w:val="0"/>
+          <w:i/>
+          <w:color w:val="130B01"/>
+          <w:sz w:val="21"/>
+        </w:rPr>
+        <w:t>swappable</w:t>
+      </w:r>
+      <w:r>
+        <w:rPr>
+          <w:rFonts w:ascii="Arial" w:hAnsi="Arial"/>
+          <w:b w:val="0"/>
+          <w:i w:val="0"/>
+          <w:color w:val="130B01"/>
+          <w:sz w:val="21"/>
+        </w:rPr>
+        <w:t xml:space="preserve"> via a single setting, and switched the live pilot onto </w:t>
+      </w:r>
+      <w:r>
+        <w:rPr>
+          <w:rFonts w:ascii="Arial" w:hAnsi="Arial"/>
+          <w:b/>
+          <w:i w:val="0"/>
+          <w:color w:val="892B90"/>
+          <w:sz w:val="21"/>
+        </w:rPr>
+        <w:t>GPT-5 (Azure OpenAI)</w:t>
+      </w:r>
+      <w:r>
+        <w:rPr>
+          <w:rFonts w:ascii="Arial" w:hAnsi="Arial"/>
+          <w:b w:val="0"/>
+          <w:i w:val="0"/>
+          <w:color w:val="130B01"/>
+          <w:sz w:val="21"/>
+        </w:rPr>
+        <w:t xml:space="preserve"> — Microsoft's own AI service, running inside Azure. It's proven working end-to-end. The same code can run Claude instead with no rewrite, so we are not locked to one model.</w:t>
       </w:r>
     </w:p>
     <w:p>
@@ -240,7 +305,7 @@
           <w:color w:val="130B01"/>
           <w:sz w:val="21"/>
         </w:rPr>
-        <w:t xml:space="preserve">the AI currently runs on </w:t>
+        <w:t xml:space="preserve">it currently runs on </w:t>
       </w:r>
       <w:r>
         <w:rPr>
@@ -260,7 +325,7 @@
           <w:color w:val="130B01"/>
           <w:sz w:val="21"/>
         </w:rPr>
-        <w:t xml:space="preserve"> Anthropic account and Azure subscription. That proves the concept — it's not how Mace should run a service it depends on. To make this a Mace service, the billing and governance need to sit inside Mace.</w:t>
+        <w:t xml:space="preserve"> Azure subscription. That proves the concept — it's not how Mace should run a service it depends on. To make this a Mace service, the billing and governance need to sit inside Mace.</w:t>
       </w:r>
     </w:p>
     <w:p>
@@ -281,7 +346,7 @@
           <w:color w:val="130B01"/>
           <w:sz w:val="28"/>
         </w:rPr>
-        <w:t>The proposal: run it on Mace's Azure, via Microsoft Foundry</w:t>
+        <w:t>The proposal: run it on Mace's Azure — Microsoft-native</w:t>
       </w:r>
     </w:p>
     <w:p>
@@ -296,7 +361,27 @@
           <w:color w:val="130B01"/>
           <w:sz w:val="21"/>
         </w:rPr>
-        <w:t>Microsoft Foundry now offers Claude directly inside Azure. That changes the commercial picture entirely:</w:t>
+        <w:t xml:space="preserve">Mace's instinct is to stay on Microsoft wherever possible. This fits that exactly. The AI now runs on </w:t>
+      </w:r>
+      <w:r>
+        <w:rPr>
+          <w:rFonts w:ascii="Arial" w:hAnsi="Arial"/>
+          <w:b/>
+          <w:i w:val="0"/>
+          <w:color w:val="892B90"/>
+          <w:sz w:val="21"/>
+        </w:rPr>
+        <w:t>Azure OpenAI</w:t>
+      </w:r>
+      <w:r>
+        <w:rPr>
+          <w:rFonts w:ascii="Arial" w:hAnsi="Arial"/>
+          <w:b w:val="0"/>
+          <w:i w:val="0"/>
+          <w:color w:val="130B01"/>
+          <w:sz w:val="21"/>
+        </w:rPr>
+        <w:t xml:space="preserve"> — the GPT models (the ChatGPT family) delivered as a first-party Microsoft Azure service:</w:t>
       </w:r>
     </w:p>
     <w:tbl>
@@ -347,7 +432,7 @@
                 <w:color w:val="FFFFFF"/>
                 <w:sz w:val="17"/>
               </w:rPr>
-              <w:t>TODAY (MY ACCOUNTS)</w:t>
+              <w:t>TODAY (MY AZURE)</w:t>
             </w:r>
           </w:p>
         </w:tc>
@@ -367,7 +452,7 @@
                 <w:color w:val="FFFFFF"/>
                 <w:sz w:val="17"/>
               </w:rPr>
-              <w:t>PROPOSED (MACE)</w:t>
+              <w:t>PROPOSED (MACE'S AZURE)</w:t>
             </w:r>
           </w:p>
         </w:tc>
@@ -447,7 +532,7 @@
                 <w:color w:val="00929F"/>
                 <w:sz w:val="19"/>
               </w:rPr>
-              <w:t>How</w:t>
+              <w:t>What it is</w:t>
             </w:r>
           </w:p>
         </w:tc>
@@ -466,7 +551,7 @@
                 <w:b w:val="0"/>
                 <w:sz w:val="19"/>
               </w:rPr>
-              <w:t>Separate Anthropic account</w:t>
+              <w:t>GPT via Azure OpenAI</w:t>
             </w:r>
           </w:p>
         </w:tc>
@@ -486,7 +571,7 @@
                 <w:color w:val="892B90"/>
                 <w:sz w:val="19"/>
               </w:rPr>
-              <w:t>Azure Marketplace — a line on the bill we already pay</w:t>
+              <w:t>Same — a native Azure service Mace already has</w:t>
             </w:r>
           </w:p>
         </w:tc>
@@ -525,7 +610,7 @@
                 <w:b w:val="0"/>
                 <w:sz w:val="19"/>
               </w:rPr>
-              <w:t>None to speak of</w:t>
+              <w:t>Mine</w:t>
             </w:r>
           </w:p>
         </w:tc>
@@ -605,7 +690,7 @@
                 <w:color w:val="892B90"/>
                 <w:sz w:val="19"/>
               </w:rPr>
-              <w:t>None. No new vendor, no new contract</w:t>
+              <w:t>None. No new vendor, no third-party sign-up</w:t>
             </w:r>
           </w:p>
         </w:tc>
@@ -647,7 +732,7 @@
           <w:color w:val="130B01"/>
           <w:sz w:val="21"/>
         </w:rPr>
-        <w:t>no new supplier to onboard and no separate AI contract to negotiate.</w:t>
+        <w:t>there is no new supplier and no AI contract to negotiate.</w:t>
       </w:r>
       <w:r>
         <w:rPr>
@@ -657,7 +742,86 @@
           <w:color w:val="130B01"/>
           <w:sz w:val="21"/>
         </w:rPr>
-        <w:t xml:space="preserve"> Claude usage simply appears as consumption on the Azure agreement Mace already has. Microsoft handles billing and governance; Anthropic operates the model.</w:t>
+        <w:t xml:space="preserve"> Azure OpenAI is Microsoft, on the Azure agreement Mace already runs. Standing it up in a Mace subscription is deploying a model and pointing the app at it — no marketplace step, no external account.</w:t>
+      </w:r>
+    </w:p>
+    <w:p>
+      <w:pPr>
+        <w:spacing w:after="40" w:before="0"/>
+      </w:pPr>
+      <w:r>
+        <w:rPr>
+          <w:rFonts w:ascii="Arial" w:hAnsi="Arial"/>
+          <w:b w:val="0"/>
+          <w:i w:val="0"/>
+          <w:color w:val="130B01"/>
+          <w:sz w:val="21"/>
+        </w:rPr>
+      </w:r>
+    </w:p>
+    <w:p>
+      <w:pPr>
+        <w:spacing w:after="120" w:before="0"/>
+      </w:pPr>
+      <w:r>
+        <w:rPr>
+          <w:rFonts w:ascii="Arial" w:hAnsi="Arial"/>
+          <w:b/>
+          <w:i w:val="0"/>
+          <w:color w:val="892B90"/>
+          <w:sz w:val="21"/>
+        </w:rPr>
+        <w:t xml:space="preserve">Model choice stays open. </w:t>
+      </w:r>
+      <w:r>
+        <w:rPr>
+          <w:rFonts w:ascii="Arial" w:hAnsi="Arial"/>
+          <w:b w:val="0"/>
+          <w:i w:val="0"/>
+          <w:color w:val="130B01"/>
+          <w:sz w:val="21"/>
+        </w:rPr>
+        <w:t xml:space="preserve">Because the backend is swappable, Mace can run </w:t>
+      </w:r>
+      <w:r>
+        <w:rPr>
+          <w:rFonts w:ascii="Arial" w:hAnsi="Arial"/>
+          <w:b/>
+          <w:i w:val="0"/>
+          <w:color w:val="130B01"/>
+          <w:sz w:val="21"/>
+        </w:rPr>
+        <w:t>Claude</w:t>
+      </w:r>
+      <w:r>
+        <w:rPr>
+          <w:rFonts w:ascii="Arial" w:hAnsi="Arial"/>
+          <w:b w:val="0"/>
+          <w:i w:val="0"/>
+          <w:color w:val="130B01"/>
+          <w:sz w:val="21"/>
+        </w:rPr>
+        <w:t xml:space="preserve"> instead (via Microsoft Foundry, also inside Azure) for content that benefits from its slightly more careful editing — a one-setting change, not a rebuild. My recommendation: </w:t>
+      </w:r>
+      <w:r>
+        <w:rPr>
+          <w:rFonts w:ascii="Arial" w:hAnsi="Arial"/>
+          <w:b/>
+          <w:i w:val="0"/>
+          <w:color w:val="130B01"/>
+          <w:sz w:val="21"/>
+        </w:rPr>
+        <w:t>default to GPT / Azure OpenAI</w:t>
+      </w:r>
+      <w:r>
+        <w:rPr>
+          <w:rFonts w:ascii="Arial" w:hAnsi="Arial"/>
+          <w:b w:val="0"/>
+          <w:i w:val="0"/>
+          <w:color w:val="130B01"/>
+          <w:sz w:val="21"/>
+        </w:rPr>
+        <w:t xml:space="preserve"> (easiest to provision and the cheaper of the two) and keep Claude available as an option.</w:t>
       </w:r>
     </w:p>
     <w:p>
@@ -704,7 +868,7 @@
           <w:color w:val="892B90"/>
           <w:sz w:val="20"/>
         </w:rPr>
-        <w:t>Microsoft Foundry</w:t>
+        <w:t>Azure OpenAI</w:t>
       </w:r>
       <w:r>
         <w:rPr>
@@ -720,7 +884,7 @@
           <w:color w:val="FDB924"/>
           <w:sz w:val="20"/>
         </w:rPr>
-        <w:t>Claude</w:t>
+        <w:t>GPT-5</w:t>
       </w:r>
     </w:p>
     <w:p>
@@ -736,7 +900,7 @@
           <w:color w:val="5B5850"/>
           <w:sz w:val="16"/>
         </w:rPr>
-        <w:t>Billing stays inside Mace's Azure agreement — no separate Anthropic contract.</w:t>
+        <w:t>Everything stays inside Mace's Azure agreement — a first-party Microsoft service, no third party.</w:t>
       </w:r>
     </w:p>
     <w:p>
@@ -772,7 +936,286 @@
           <w:color w:val="130B01"/>
           <w:sz w:val="21"/>
         </w:rPr>
-        <w:t xml:space="preserve">Consumption-based, and genuinely cheap at this scale. A document validation is a few thousand tokens of AI — </w:t>
+        <w:t>Consumption-based and genuinely cheap. I measured both models on real documents through the live pipeline:</w:t>
+      </w:r>
+    </w:p>
+    <w:tbl>
+      <w:tblPr>
+        <w:tblStyle w:val="TableGrid"/>
+        <w:tblW w:type="auto" w:w="0"/>
+        <w:jc w:val="center"/>
+        <w:tblLook w:firstColumn="1" w:firstRow="1" w:lastColumn="0" w:lastRow="0" w:noHBand="0" w:noVBand="1" w:val="04A0"/>
+      </w:tblPr>
+      <w:tblGrid>
+        <w:gridCol w:w="3324"/>
+        <w:gridCol w:w="3324"/>
+        <w:gridCol w:w="3324"/>
+      </w:tblGrid>
+      <w:tr>
+        <w:tc>
+          <w:tcPr>
+            <w:tcW w:type="dxa" w:w="3324"/>
+            <w:shd w:val="clear" w:fill="130B01"/>
+          </w:tcPr>
+          <w:p>
+            <w:pPr>
+              <w:spacing w:after="0"/>
+            </w:pPr>
+            <w:r>
+              <w:rPr>
+                <w:rFonts w:ascii="Arial" w:hAnsi="Arial"/>
+                <w:b/>
+                <w:color w:val="FFFFFF"/>
+                <w:sz w:val="17"/>
+              </w:rPr>
+              <w:t>DOCUMENT SIZE</w:t>
+            </w:r>
+          </w:p>
+        </w:tc>
+        <w:tc>
+          <w:tcPr>
+            <w:tcW w:type="dxa" w:w="3324"/>
+            <w:shd w:val="clear" w:fill="130B01"/>
+          </w:tcPr>
+          <w:p>
+            <w:pPr>
+              <w:spacing w:after="0"/>
+            </w:pPr>
+            <w:r>
+              <w:rPr>
+                <w:rFonts w:ascii="Arial" w:hAnsi="Arial"/>
+                <w:b/>
+                <w:color w:val="FFFFFF"/>
+                <w:sz w:val="17"/>
+              </w:rPr>
+              <w:t>GPT-5-MINI (RECOMMENDED)</w:t>
+            </w:r>
+          </w:p>
+        </w:tc>
+        <w:tc>
+          <w:tcPr>
+            <w:tcW w:type="dxa" w:w="3324"/>
+            <w:shd w:val="clear" w:fill="130B01"/>
+          </w:tcPr>
+          <w:p>
+            <w:pPr>
+              <w:spacing w:after="0"/>
+            </w:pPr>
+            <w:r>
+              <w:rPr>
+                <w:rFonts w:ascii="Arial" w:hAnsi="Arial"/>
+                <w:b/>
+                <w:color w:val="FFFFFF"/>
+                <w:sz w:val="17"/>
+              </w:rPr>
+              <w:t>CLAUDE (ALTERNATIVE)</w:t>
+            </w:r>
+          </w:p>
+        </w:tc>
+      </w:tr>
+      <w:tr>
+        <w:tc>
+          <w:tcPr>
+            <w:tcW w:type="dxa" w:w="3324"/>
+          </w:tcPr>
+          <w:p>
+            <w:pPr>
+              <w:spacing w:after="0"/>
+            </w:pPr>
+            <w:r>
+              <w:rPr>
+                <w:rFonts w:ascii="Arial" w:hAnsi="Arial"/>
+                <w:b w:val="0"/>
+                <w:sz w:val="19"/>
+              </w:rPr>
+              <w:t>~1 page</w:t>
+            </w:r>
+          </w:p>
+        </w:tc>
+        <w:tc>
+          <w:tcPr>
+            <w:tcW w:type="dxa" w:w="3324"/>
+          </w:tcPr>
+          <w:p>
+            <w:pPr>
+              <w:spacing w:after="0"/>
+            </w:pPr>
+            <w:r>
+              <w:rPr>
+                <w:rFonts w:ascii="Arial" w:hAnsi="Arial"/>
+                <w:b/>
+                <w:color w:val="892B90"/>
+                <w:sz w:val="19"/>
+              </w:rPr>
+              <w:t>£0.003</w:t>
+            </w:r>
+          </w:p>
+        </w:tc>
+        <w:tc>
+          <w:tcPr>
+            <w:tcW w:type="dxa" w:w="3324"/>
+          </w:tcPr>
+          <w:p>
+            <w:pPr>
+              <w:spacing w:after="0"/>
+            </w:pPr>
+            <w:r>
+              <w:rPr>
+                <w:rFonts w:ascii="Arial" w:hAnsi="Arial"/>
+                <w:b w:val="0"/>
+                <w:sz w:val="19"/>
+              </w:rPr>
+              <w:t>£0.004</w:t>
+            </w:r>
+          </w:p>
+        </w:tc>
+      </w:tr>
+      <w:tr>
+        <w:tc>
+          <w:tcPr>
+            <w:tcW w:type="dxa" w:w="3324"/>
+            <w:shd w:val="clear" w:fill="F6F8F8"/>
+          </w:tcPr>
+          <w:p>
+            <w:pPr>
+              <w:spacing w:after="0"/>
+            </w:pPr>
+            <w:r>
+              <w:rPr>
+                <w:rFonts w:ascii="Arial" w:hAnsi="Arial"/>
+                <w:b w:val="0"/>
+                <w:sz w:val="19"/>
+              </w:rPr>
+              <w:t>~3 pages</w:t>
+            </w:r>
+          </w:p>
+        </w:tc>
+        <w:tc>
+          <w:tcPr>
+            <w:tcW w:type="dxa" w:w="3324"/>
+            <w:shd w:val="clear" w:fill="F6F8F8"/>
+          </w:tcPr>
+          <w:p>
+            <w:pPr>
+              <w:spacing w:after="0"/>
+            </w:pPr>
+            <w:r>
+              <w:rPr>
+                <w:rFonts w:ascii="Arial" w:hAnsi="Arial"/>
+                <w:b/>
+                <w:color w:val="892B90"/>
+                <w:sz w:val="19"/>
+              </w:rPr>
+              <w:t>£0.004</w:t>
+            </w:r>
+          </w:p>
+        </w:tc>
+        <w:tc>
+          <w:tcPr>
+            <w:tcW w:type="dxa" w:w="3324"/>
+            <w:shd w:val="clear" w:fill="F6F8F8"/>
+          </w:tcPr>
+          <w:p>
+            <w:pPr>
+              <w:spacing w:after="0"/>
+            </w:pPr>
+            <w:r>
+              <w:rPr>
+                <w:rFonts w:ascii="Arial" w:hAnsi="Arial"/>
+                <w:b w:val="0"/>
+                <w:sz w:val="19"/>
+              </w:rPr>
+              <w:t>£0.008</w:t>
+            </w:r>
+          </w:p>
+        </w:tc>
+      </w:tr>
+      <w:tr>
+        <w:tc>
+          <w:tcPr>
+            <w:tcW w:type="dxa" w:w="3324"/>
+          </w:tcPr>
+          <w:p>
+            <w:pPr>
+              <w:spacing w:after="0"/>
+            </w:pPr>
+            <w:r>
+              <w:rPr>
+                <w:rFonts w:ascii="Arial" w:hAnsi="Arial"/>
+                <w:b w:val="0"/>
+                <w:sz w:val="19"/>
+              </w:rPr>
+              <w:t>~8 pages</w:t>
+            </w:r>
+          </w:p>
+        </w:tc>
+        <w:tc>
+          <w:tcPr>
+            <w:tcW w:type="dxa" w:w="3324"/>
+          </w:tcPr>
+          <w:p>
+            <w:pPr>
+              <w:spacing w:after="0"/>
+            </w:pPr>
+            <w:r>
+              <w:rPr>
+                <w:rFonts w:ascii="Arial" w:hAnsi="Arial"/>
+                <w:b/>
+                <w:color w:val="892B90"/>
+                <w:sz w:val="19"/>
+              </w:rPr>
+              <w:t>£0.008</w:t>
+            </w:r>
+          </w:p>
+        </w:tc>
+        <w:tc>
+          <w:tcPr>
+            <w:tcW w:type="dxa" w:w="3324"/>
+          </w:tcPr>
+          <w:p>
+            <w:pPr>
+              <w:spacing w:after="0"/>
+            </w:pPr>
+            <w:r>
+              <w:rPr>
+                <w:rFonts w:ascii="Arial" w:hAnsi="Arial"/>
+                <w:b w:val="0"/>
+                <w:sz w:val="19"/>
+              </w:rPr>
+              <w:t>£0.015</w:t>
+            </w:r>
+          </w:p>
+        </w:tc>
+      </w:tr>
+    </w:tbl>
+    <w:p>
+      <w:pPr>
+        <w:spacing w:after="120" w:before="0"/>
+      </w:pPr>
+      <w:r>
+        <w:rPr>
+          <w:rFonts w:ascii="Arial" w:hAnsi="Arial"/>
+          <w:b w:val="0"/>
+          <w:i/>
+          <w:color w:val="5B5850"/>
+          <w:sz w:val="16"/>
+        </w:rPr>
+        <w:t>US-dollar list prices, converted approximately; Mace's enterprise Azure agreement would likely discount further.</w:t>
+      </w:r>
+    </w:p>
+    <w:p>
+      <w:pPr>
+        <w:spacing w:after="120" w:before="0"/>
+      </w:pPr>
+      <w:r>
+        <w:rPr>
+          <w:rFonts w:ascii="Arial" w:hAnsi="Arial"/>
+          <w:b w:val="0"/>
+          <w:i w:val="0"/>
+          <w:color w:val="130B01"/>
+          <w:sz w:val="21"/>
+        </w:rPr>
+        <w:t xml:space="preserve">GPT is </w:t>
       </w:r>
       <w:r>
         <w:rPr>
@@ -782,7 +1225,7 @@
           <w:color w:val="130B01"/>
           <w:sz w:val="21"/>
         </w:rPr>
-        <w:t>fractions of a penny to a couple of pence per document</w:t>
+        <w:t>~35–50% cheaper per document</w:t>
       </w:r>
       <w:r>
         <w:rPr>
@@ -792,7 +1235,27 @@
           <w:color w:val="130B01"/>
           <w:sz w:val="21"/>
         </w:rPr>
-        <w:t>. Even at hundreds of documents a day, this is a rounding error against the value of consistent, on-brand documentation across the Control Centre. No upfront commitment; Mace pays only for what it uses.</w:t>
+        <w:t xml:space="preserve"> than Claude, and the gap widens with length — but in absolute terms both are a </w:t>
+      </w:r>
+      <w:r>
+        <w:rPr>
+          <w:rFonts w:ascii="Arial" w:hAnsi="Arial"/>
+          <w:b/>
+          <w:i w:val="0"/>
+          <w:color w:val="130B01"/>
+          <w:sz w:val="21"/>
+        </w:rPr>
+        <w:t>rounding error</w:t>
+      </w:r>
+      <w:r>
+        <w:rPr>
+          <w:rFonts w:ascii="Arial" w:hAnsi="Arial"/>
+          <w:b w:val="0"/>
+          <w:i w:val="0"/>
+          <w:color w:val="130B01"/>
+          <w:sz w:val="21"/>
+        </w:rPr>
+        <w:t>: realistic Control Centre volume is a few pounds a month. No upfront commitment; Mace pays only for what it uses. Cost isn't the deciding factor — ease of ownership is, and Azure OpenAI wins on both.</w:t>
       </w:r>
     </w:p>
     <w:p>
@@ -855,7 +1318,7 @@
           <w:rFonts w:ascii="Arial" w:hAnsi="Arial"/>
           <w:sz w:val="21"/>
         </w:rPr>
-        <w:t xml:space="preserve"> — document text is processed by a US-hosted model. Foundry's US data zone and Azure governance are built for exactly this; it needs Sapna's sign-off, which I'll tee up.</w:t>
+        <w:t xml:space="preserve"> — document text is processed by a US-hosted model. Azure OpenAI's data zone and Azure-native governance are built for exactly this; it needs Sapna's sign-off, which I'll tee up.</w:t>
       </w:r>
     </w:p>
     <w:p>
@@ -876,7 +1339,7 @@
           <w:rFonts w:ascii="Arial" w:hAnsi="Arial"/>
           <w:sz w:val="21"/>
         </w:rPr>
-        <w:t xml:space="preserve"> — to cut over. I've already rehearsed the entire handover in a test environment, so this is execution, not discovery.</w:t>
+        <w:t xml:space="preserve"> — to cut over. I've already built and proven the whole path on the live pilot, so this is execution, not discovery.</w:t>
       </w:r>
     </w:p>
     <w:tbl>
@@ -936,7 +1399,7 @@
                 <w:color w:val="D9D5CC"/>
                 <w:sz w:val="20"/>
               </w:rPr>
-              <w:t xml:space="preserve"> It shows a repeatable pattern: identify a real Mace problem, stand up an AI service to solve it, and hand it over running on Mace's own billing and governance — safely, cheaply, and without a procurement cycle.</w:t>
+              <w:t xml:space="preserve"> It shows a repeatable pattern: identify a real Mace problem, stand up an AI service to solve it, and hand it over running on Mace's own Microsoft/Azure billing and governance — safely, cheaply, and without a procurement cycle.</w:t>
             </w:r>
           </w:p>
           <w:p>
@@ -1000,7 +1463,7 @@
           <w:color w:val="5B5850"/>
           <w:sz w:val="16"/>
         </w:rPr>
-        <w:t>Technical detail for whoever provisions it: see the companion Foundry Handover Runbook.  ·  Stephen Cummins · AI Service Lead, Mace Digital · stephen.cummins@macegroup.com</w:t>
+        <w:t>Technical detail for whoever provisions it: see the companion Handover Runbook (covers both the Azure OpenAI / GPT and Foundry / Claude setups).  ·  Stephen Cummins · AI Service Lead, Mace Digital · stephen.cummins@macegroup.com</w:t>
       </w:r>
     </w:p>
     <w:sectPr>

</xml_diff>